<commit_message>
modified docs and src
</commit_message>
<xml_diff>
--- a/docs/IT0206_IBSU_Lunch_Ordering_System_Documentation.docx
+++ b/docs/IT0206_IBSU_Lunch_Ordering_System_Documentation.docx
@@ -60,13 +60,7 @@
         <w:rPr>
           <w:sz w:val="22"/>
         </w:rPr>
-        <w:t>Gunther Darius— ST240158</w:t>
-      </w:r>
-      <w:r>
-        <w:rPr>
-          <w:sz w:val="22"/>
-        </w:rPr>
-        <w:t>]</w:t>
+        <w:t>Gunther Darius— ST240158]</w:t>
       </w:r>
     </w:p>
     <w:p>
@@ -97,21 +91,7 @@
           <w:sz w:val="22"/>
           <w:szCs w:val="22"/>
         </w:rPr>
-        <w:t>[</w:t>
-      </w:r>
-      <w:r>
-        <w:rPr>
-          <w:sz w:val="22"/>
-          <w:szCs w:val="22"/>
-        </w:rPr>
-        <w:t>Johannesh Pesh T240723</w:t>
-      </w:r>
-      <w:r>
-        <w:rPr>
-          <w:sz w:val="22"/>
-          <w:szCs w:val="22"/>
-        </w:rPr>
-        <w:t>]</w:t>
+        <w:t>[Johannesh Pesh T240723]</w:t>
       </w:r>
     </w:p>
     <w:p>
@@ -169,16 +149,7 @@
         <w:ind w:left="58"/>
       </w:pPr>
       <w:r>
-        <w:t>T</w:t>
-      </w:r>
-      <w:r>
-        <w:t>eam members: [</w:t>
-      </w:r>
-      <w:r>
-        <w:t>Gunther Darius — ST240158</w:t>
-      </w:r>
-      <w:r>
-        <w:t>]</w:t>
+        <w:t>Team members: [Gunther Darius — ST240158]</w:t>
       </w:r>
     </w:p>
     <w:p>
@@ -198,25 +169,7 @@
         <w:rPr>
           <w:szCs w:val="18"/>
         </w:rPr>
-        <w:t>[</w:t>
-      </w:r>
-      <w:r>
-        <w:rPr>
-          <w:szCs w:val="18"/>
-        </w:rPr>
-        <w:t>Johannesh Pesh T240723</w:t>
-      </w:r>
-      <w:r>
-        <w:rPr>
-          <w:szCs w:val="18"/>
-        </w:rPr>
-        <w:t>]</w:t>
-      </w:r>
-      <w:r>
-        <w:rPr>
-          <w:szCs w:val="18"/>
-        </w:rPr>
-        <w:t xml:space="preserve">, </w:t>
+        <w:t xml:space="preserve">[Johannesh Pesh T240723], </w:t>
       </w:r>
     </w:p>
     <w:p>
@@ -224,10 +177,7 @@
         <w:ind w:left="58"/>
       </w:pPr>
       <w:r>
-        <w:t xml:space="preserve">                           </w:t>
-      </w:r>
-      <w:r>
-        <w:t>[Team Member 3 — ID]</w:t>
+        <w:t xml:space="preserve">                           [Team Member 3 — ID]</w:t>
       </w:r>
     </w:p>
     <w:p>
@@ -527,7 +477,6 @@
         <w:tblCellMar>
           <w:top w:w="98" w:type="dxa"/>
           <w:left w:w="120" w:type="dxa"/>
-          <w:bottom w:w="0" w:type="dxa"/>
           <w:right w:w="115" w:type="dxa"/>
         </w:tblCellMar>
         <w:tblLook w:val="04A0" w:firstRow="1" w:lastRow="0" w:firstColumn="1" w:lastColumn="0" w:noHBand="0" w:noVBand="1"/>
@@ -824,7 +773,6 @@
         <w:tblCellMar>
           <w:top w:w="98" w:type="dxa"/>
           <w:left w:w="120" w:type="dxa"/>
-          <w:bottom w:w="0" w:type="dxa"/>
           <w:right w:w="115" w:type="dxa"/>
         </w:tblCellMar>
         <w:tblLook w:val="04A0" w:firstRow="1" w:lastRow="0" w:firstColumn="1" w:lastColumn="0" w:noHBand="0" w:noVBand="1"/>
@@ -1170,6 +1118,7 @@
         <w:ind w:right="56"/>
       </w:pPr>
       <w:r>
+        <w:lastRenderedPageBreak/>
         <w:t>IT0206 Assessment 2 — Software Requirements Specification (SRS)</w:t>
       </w:r>
     </w:p>
@@ -1426,7 +1375,6 @@
         <w:tblCellMar>
           <w:top w:w="98" w:type="dxa"/>
           <w:left w:w="120" w:type="dxa"/>
-          <w:bottom w:w="0" w:type="dxa"/>
           <w:right w:w="115" w:type="dxa"/>
         </w:tblCellMar>
         <w:tblLook w:val="04A0" w:firstRow="1" w:lastRow="0" w:firstColumn="1" w:lastColumn="0" w:noHBand="0" w:noVBand="1"/>
@@ -2237,6 +2185,7 @@
               <w:rPr>
                 <w:sz w:val="14"/>
               </w:rPr>
+              <w:lastRenderedPageBreak/>
               <w:t>FR-10</w:t>
             </w:r>
           </w:p>
@@ -2441,19 +2390,11 @@
               <w:spacing w:after="0" w:line="259" w:lineRule="auto"/>
               <w:ind w:left="0" w:firstLine="0"/>
             </w:pPr>
-            <w:proofErr w:type="spellStart"/>
-            <w:r>
-              <w:rPr>
-                <w:sz w:val="14"/>
-              </w:rPr>
-              <w:t>FileService</w:t>
-            </w:r>
-            <w:proofErr w:type="spellEnd"/>
-            <w:r>
-              <w:rPr>
-                <w:sz w:val="14"/>
-              </w:rPr>
-              <w:t xml:space="preserve"> tests and sample files</w:t>
+            <w:r>
+              <w:rPr>
+                <w:sz w:val="14"/>
+              </w:rPr>
+              <w:t>FileService tests and sample files</w:t>
             </w:r>
           </w:p>
         </w:tc>
@@ -3016,7 +2957,6 @@
         <w:tblCellMar>
           <w:top w:w="98" w:type="dxa"/>
           <w:left w:w="120" w:type="dxa"/>
-          <w:bottom w:w="0" w:type="dxa"/>
           <w:right w:w="115" w:type="dxa"/>
         </w:tblCellMar>
         <w:tblLook w:val="04A0" w:firstRow="1" w:lastRow="0" w:firstColumn="1" w:lastColumn="0" w:noHBand="0" w:noVBand="1"/>
@@ -3371,21 +3311,7 @@
               <w:rPr>
                 <w:sz w:val="14"/>
               </w:rPr>
-              <w:t>`</w:t>
-            </w:r>
-            <w:proofErr w:type="spellStart"/>
-            <w:r>
-              <w:rPr>
-                <w:sz w:val="14"/>
-              </w:rPr>
-              <w:t>FileService</w:t>
-            </w:r>
-            <w:proofErr w:type="spellEnd"/>
-            <w:r>
-              <w:rPr>
-                <w:sz w:val="14"/>
-              </w:rPr>
-              <w:t>`</w:t>
+              <w:t>`FileService`</w:t>
             </w:r>
           </w:p>
         </w:tc>
@@ -3414,6 +3340,7 @@
               <w:rPr>
                 <w:sz w:val="14"/>
               </w:rPr>
+              <w:lastRenderedPageBreak/>
               <w:t>Reporting</w:t>
             </w:r>
           </w:p>
@@ -3627,6 +3554,7 @@
         <w:rPr>
           <w:sz w:val="16"/>
         </w:rPr>
+        <w:lastRenderedPageBreak/>
         <w:t>IT0206 Advanced Computer Programming 2 — Assessment 2</w:t>
       </w:r>
       <w:r>
@@ -3692,7 +3620,6 @@
         <w:tblCellMar>
           <w:top w:w="97" w:type="dxa"/>
           <w:left w:w="120" w:type="dxa"/>
-          <w:bottom w:w="0" w:type="dxa"/>
           <w:right w:w="115" w:type="dxa"/>
         </w:tblCellMar>
         <w:tblLook w:val="04A0" w:firstRow="1" w:lastRow="0" w:firstColumn="1" w:lastColumn="0" w:noHBand="0" w:noVBand="1"/>
@@ -4949,6 +4876,7 @@
           <w:rFonts w:ascii="Courier New" w:eastAsia="Courier New" w:hAnsi="Courier New" w:cs="Courier New"/>
           <w:sz w:val="14"/>
         </w:rPr>
+        <w:lastRenderedPageBreak/>
         <w:t>sqlite3 database/</w:t>
       </w:r>
       <w:proofErr w:type="spellStart"/>
@@ -4965,8 +4893,17 @@
           <w:rFonts w:ascii="Courier New" w:eastAsia="Courier New" w:hAnsi="Courier New" w:cs="Courier New"/>
           <w:sz w:val="14"/>
         </w:rPr>
-        <w:t xml:space="preserve"> &lt; database/schema.sql</w:t>
-      </w:r>
+        <w:t xml:space="preserve"> &lt; database/</w:t>
+      </w:r>
+      <w:proofErr w:type="spellStart"/>
+      <w:r>
+        <w:rPr>
+          <w:rFonts w:ascii="Courier New" w:eastAsia="Courier New" w:hAnsi="Courier New" w:cs="Courier New"/>
+          <w:sz w:val="14"/>
+        </w:rPr>
+        <w:t>schema.sql</w:t>
+      </w:r>
+      <w:proofErr w:type="spellEnd"/>
     </w:p>
     <w:p>
       <w:pPr>
@@ -5008,6 +4945,7 @@
           <w:b/>
           <w:sz w:val="38"/>
         </w:rPr>
+        <w:lastRenderedPageBreak/>
         <w:t>IBSU Lunch Ordering System — User Manual</w:t>
       </w:r>
     </w:p>
@@ -5309,7 +5247,39 @@
           <w:rFonts w:ascii="Courier New" w:eastAsia="Courier New" w:hAnsi="Courier New" w:cs="Courier New"/>
           <w:sz w:val="14"/>
         </w:rPr>
-        <w:t>python -m pytest -q --cov=</w:t>
+        <w:t xml:space="preserve">python -m </w:t>
+      </w:r>
+      <w:proofErr w:type="spellStart"/>
+      <w:r>
+        <w:rPr>
+          <w:rFonts w:ascii="Courier New" w:eastAsia="Courier New" w:hAnsi="Courier New" w:cs="Courier New"/>
+          <w:sz w:val="14"/>
+        </w:rPr>
+        <w:t>pytest</w:t>
+      </w:r>
+      <w:proofErr w:type="spellEnd"/>
+      <w:r>
+        <w:rPr>
+          <w:rFonts w:ascii="Courier New" w:eastAsia="Courier New" w:hAnsi="Courier New" w:cs="Courier New"/>
+          <w:sz w:val="14"/>
+        </w:rPr>
+        <w:t xml:space="preserve"> -q --</w:t>
+      </w:r>
+      <w:proofErr w:type="spellStart"/>
+      <w:r>
+        <w:rPr>
+          <w:rFonts w:ascii="Courier New" w:eastAsia="Courier New" w:hAnsi="Courier New" w:cs="Courier New"/>
+          <w:sz w:val="14"/>
+        </w:rPr>
+        <w:t>cov</w:t>
+      </w:r>
+      <w:proofErr w:type="spellEnd"/>
+      <w:r>
+        <w:rPr>
+          <w:rFonts w:ascii="Courier New" w:eastAsia="Courier New" w:hAnsi="Courier New" w:cs="Courier New"/>
+          <w:sz w:val="14"/>
+        </w:rPr>
+        <w:t>=</w:t>
       </w:r>
       <w:proofErr w:type="spellStart"/>
       <w:proofErr w:type="gramStart"/>
@@ -5327,7 +5297,23 @@
           <w:rFonts w:ascii="Courier New" w:eastAsia="Courier New" w:hAnsi="Courier New" w:cs="Courier New"/>
           <w:sz w:val="14"/>
         </w:rPr>
-        <w:t xml:space="preserve"> --cov=</w:t>
+        <w:t xml:space="preserve"> --</w:t>
+      </w:r>
+      <w:proofErr w:type="spellStart"/>
+      <w:r>
+        <w:rPr>
+          <w:rFonts w:ascii="Courier New" w:eastAsia="Courier New" w:hAnsi="Courier New" w:cs="Courier New"/>
+          <w:sz w:val="14"/>
+        </w:rPr>
+        <w:t>cov</w:t>
+      </w:r>
+      <w:proofErr w:type="spellEnd"/>
+      <w:r>
+        <w:rPr>
+          <w:rFonts w:ascii="Courier New" w:eastAsia="Courier New" w:hAnsi="Courier New" w:cs="Courier New"/>
+          <w:sz w:val="14"/>
+        </w:rPr>
+        <w:t>=</w:t>
       </w:r>
       <w:proofErr w:type="spellStart"/>
       <w:r>
@@ -5343,7 +5329,23 @@
           <w:rFonts w:ascii="Courier New" w:eastAsia="Courier New" w:hAnsi="Courier New" w:cs="Courier New"/>
           <w:sz w:val="14"/>
         </w:rPr>
-        <w:t xml:space="preserve"> --cov=</w:t>
+        <w:t xml:space="preserve"> --</w:t>
+      </w:r>
+      <w:proofErr w:type="spellStart"/>
+      <w:r>
+        <w:rPr>
+          <w:rFonts w:ascii="Courier New" w:eastAsia="Courier New" w:hAnsi="Courier New" w:cs="Courier New"/>
+          <w:sz w:val="14"/>
+        </w:rPr>
+        <w:t>cov</w:t>
+      </w:r>
+      <w:proofErr w:type="spellEnd"/>
+      <w:r>
+        <w:rPr>
+          <w:rFonts w:ascii="Courier New" w:eastAsia="Courier New" w:hAnsi="Courier New" w:cs="Courier New"/>
+          <w:sz w:val="14"/>
+        </w:rPr>
+        <w:t>=</w:t>
       </w:r>
       <w:proofErr w:type="spellStart"/>
       <w:r>
@@ -5359,7 +5361,23 @@
           <w:rFonts w:ascii="Courier New" w:eastAsia="Courier New" w:hAnsi="Courier New" w:cs="Courier New"/>
           <w:sz w:val="14"/>
         </w:rPr>
-        <w:t xml:space="preserve"> --cov=</w:t>
+        <w:t xml:space="preserve"> --</w:t>
+      </w:r>
+      <w:proofErr w:type="spellStart"/>
+      <w:r>
+        <w:rPr>
+          <w:rFonts w:ascii="Courier New" w:eastAsia="Courier New" w:hAnsi="Courier New" w:cs="Courier New"/>
+          <w:sz w:val="14"/>
+        </w:rPr>
+        <w:t>cov</w:t>
+      </w:r>
+      <w:proofErr w:type="spellEnd"/>
+      <w:r>
+        <w:rPr>
+          <w:rFonts w:ascii="Courier New" w:eastAsia="Courier New" w:hAnsi="Courier New" w:cs="Courier New"/>
+          <w:sz w:val="14"/>
+        </w:rPr>
+        <w:t>=</w:t>
       </w:r>
       <w:proofErr w:type="spellStart"/>
       <w:r>
@@ -5375,7 +5393,23 @@
           <w:rFonts w:ascii="Courier New" w:eastAsia="Courier New" w:hAnsi="Courier New" w:cs="Courier New"/>
           <w:sz w:val="14"/>
         </w:rPr>
-        <w:t xml:space="preserve"> --cov=</w:t>
+        <w:t xml:space="preserve"> --</w:t>
+      </w:r>
+      <w:proofErr w:type="spellStart"/>
+      <w:r>
+        <w:rPr>
+          <w:rFonts w:ascii="Courier New" w:eastAsia="Courier New" w:hAnsi="Courier New" w:cs="Courier New"/>
+          <w:sz w:val="14"/>
+        </w:rPr>
+        <w:t>cov</w:t>
+      </w:r>
+      <w:proofErr w:type="spellEnd"/>
+      <w:r>
+        <w:rPr>
+          <w:rFonts w:ascii="Courier New" w:eastAsia="Courier New" w:hAnsi="Courier New" w:cs="Courier New"/>
+          <w:sz w:val="14"/>
+        </w:rPr>
+        <w:t>=</w:t>
       </w:r>
       <w:proofErr w:type="spellStart"/>
       <w:r>
@@ -5391,7 +5425,23 @@
           <w:rFonts w:ascii="Courier New" w:eastAsia="Courier New" w:hAnsi="Courier New" w:cs="Courier New"/>
           <w:sz w:val="14"/>
         </w:rPr>
-        <w:t xml:space="preserve"> --cov-report=term-missing</w:t>
+        <w:t xml:space="preserve"> --</w:t>
+      </w:r>
+      <w:proofErr w:type="spellStart"/>
+      <w:r>
+        <w:rPr>
+          <w:rFonts w:ascii="Courier New" w:eastAsia="Courier New" w:hAnsi="Courier New" w:cs="Courier New"/>
+          <w:sz w:val="14"/>
+        </w:rPr>
+        <w:t>cov</w:t>
+      </w:r>
+      <w:proofErr w:type="spellEnd"/>
+      <w:r>
+        <w:rPr>
+          <w:rFonts w:ascii="Courier New" w:eastAsia="Courier New" w:hAnsi="Courier New" w:cs="Courier New"/>
+          <w:sz w:val="14"/>
+        </w:rPr>
+        <w:t>-report=term-missing</w:t>
       </w:r>
     </w:p>
     <w:p>
@@ -5551,6 +5601,7 @@
         <w:ind w:hanging="116"/>
       </w:pPr>
       <w:r>
+        <w:lastRenderedPageBreak/>
         <w:t>Student: `student` / `student123`</w:t>
       </w:r>
     </w:p>
@@ -5846,6 +5897,7 @@
         <w:rPr>
           <w:noProof/>
         </w:rPr>
+        <w:lastRenderedPageBreak/>
         <w:drawing>
           <wp:inline distT="0" distB="0" distL="0" distR="0" wp14:anchorId="49A82CB4" wp14:editId="53C7D765">
             <wp:extent cx="5220000" cy="2700000"/>
@@ -6191,6 +6243,7 @@
         <w:rPr>
           <w:noProof/>
         </w:rPr>
+        <w:lastRenderedPageBreak/>
         <w:drawing>
           <wp:inline distT="0" distB="0" distL="0" distR="0" wp14:anchorId="349F2E03" wp14:editId="59B4E747">
             <wp:extent cx="5220000" cy="2700000"/>
@@ -6455,6 +6508,7 @@
         <w:ind w:hanging="116"/>
       </w:pPr>
       <w:r>
+        <w:lastRenderedPageBreak/>
         <w:t>`</w:t>
       </w:r>
       <w:proofErr w:type="spellStart"/>
@@ -6993,7 +7047,6 @@
         <w:tblCellMar>
           <w:top w:w="98" w:type="dxa"/>
           <w:left w:w="120" w:type="dxa"/>
-          <w:bottom w:w="0" w:type="dxa"/>
           <w:right w:w="115" w:type="dxa"/>
         </w:tblCellMar>
         <w:tblLook w:val="04A0" w:firstRow="1" w:lastRow="0" w:firstColumn="1" w:lastColumn="0" w:noHBand="0" w:noVBand="1"/>
@@ -7136,6 +7189,7 @@
               <w:rPr>
                 <w:sz w:val="14"/>
               </w:rPr>
+              <w:lastRenderedPageBreak/>
               <w:t>Constructors</w:t>
             </w:r>
           </w:p>
@@ -7684,15 +7738,7 @@
         <w:ind w:left="58"/>
       </w:pPr>
       <w:r>
-        <w:t xml:space="preserve">Repositories use parameterised SQL </w:t>
-      </w:r>
-      <w:proofErr w:type="gramStart"/>
-      <w:r>
-        <w:t>with ?</w:t>
-      </w:r>
-      <w:proofErr w:type="gramEnd"/>
-      <w:r>
-        <w:t xml:space="preserve"> placeholders. No user input is concatenated into SQL statements. The order repository performs multi-step transactions for order creation, cancellation and administrative deletion.</w:t>
+        <w:t>Repositories use parameterised SQL with? placeholders. No user input is concatenated into SQL statements. The order repository performs multi-step transactions for order creation, cancellation and administrative deletion.</w:t>
       </w:r>
     </w:p>
     <w:p>
@@ -7711,15 +7757,7 @@
         <w:jc w:val="both"/>
       </w:pPr>
       <w:r>
-        <w:t xml:space="preserve">Custom exceptions inherit from </w:t>
-      </w:r>
-      <w:proofErr w:type="spellStart"/>
-      <w:r>
-        <w:t>IBSUAppError</w:t>
-      </w:r>
-      <w:proofErr w:type="spellEnd"/>
-      <w:r>
-        <w:t xml:space="preserve">, including credential, validation, stock, order, category, database, file and report errors. Controllers convert these exceptions into user-facing messages while logging unexpected failures. </w:t>
+        <w:t xml:space="preserve">Custom exceptions inherit from IBSUAppError, including credential, validation, stock, order, category, database, file and report errors. Controllers convert these exceptions into user-facing messages while logging unexpected failures. </w:t>
       </w:r>
       <w:r>
         <w:rPr>
@@ -7733,13 +7771,8 @@
       <w:pPr>
         <w:ind w:left="58"/>
       </w:pPr>
-      <w:proofErr w:type="spellStart"/>
-      <w:r>
-        <w:t>FileService</w:t>
-      </w:r>
-      <w:proofErr w:type="spellEnd"/>
-      <w:r>
-        <w:t xml:space="preserve"> demonstrates:</w:t>
+      <w:r>
+        <w:t>FileService demonstrates:</w:t>
       </w:r>
     </w:p>
     <w:p>
@@ -7751,25 +7784,7 @@
         <w:ind w:hanging="116"/>
       </w:pPr>
       <w:r>
-        <w:t>CSV reading/writing using `</w:t>
-      </w:r>
-      <w:proofErr w:type="spellStart"/>
-      <w:proofErr w:type="gramStart"/>
-      <w:r>
-        <w:t>csv.DictReader</w:t>
-      </w:r>
-      <w:proofErr w:type="spellEnd"/>
-      <w:proofErr w:type="gramEnd"/>
-      <w:r>
-        <w:t>` and `</w:t>
-      </w:r>
-      <w:proofErr w:type="spellStart"/>
-      <w:r>
-        <w:t>csv.DictWriter</w:t>
-      </w:r>
-      <w:proofErr w:type="spellEnd"/>
-      <w:r>
-        <w:t>`.</w:t>
+        <w:t>CSV reading/writing using `csv.DictReader` and `csv.DictWriter`.</w:t>
       </w:r>
     </w:p>
     <w:p>
@@ -7781,23 +7796,7 @@
         <w:ind w:hanging="116"/>
       </w:pPr>
       <w:r>
-        <w:t>JSON reading/writing using `</w:t>
-      </w:r>
-      <w:proofErr w:type="gramStart"/>
-      <w:r>
-        <w:t>json.load</w:t>
-      </w:r>
-      <w:proofErr w:type="gramEnd"/>
-      <w:r>
-        <w:t>` and `</w:t>
-      </w:r>
-      <w:proofErr w:type="spellStart"/>
-      <w:r>
-        <w:t>json.dump</w:t>
-      </w:r>
-      <w:proofErr w:type="spellEnd"/>
-      <w:r>
-        <w:t>`.</w:t>
+        <w:t>JSON reading/writing using `json.load` and `json.dump`.</w:t>
       </w:r>
     </w:p>
     <w:p>
@@ -7891,6 +7890,7 @@
         <w:ind w:left="58"/>
       </w:pPr>
       <w:r>
+        <w:lastRenderedPageBreak/>
         <w:t>10. Security and Privacy</w:t>
       </w:r>
     </w:p>
@@ -7900,15 +7900,7 @@
         <w:ind w:left="58"/>
       </w:pPr>
       <w:r>
-        <w:t xml:space="preserve">Passwords are stored as SHA-256 hashes for this academic implementation. A production deployment should use a password-specific password hashing algorithm such as Argon2 or </w:t>
-      </w:r>
-      <w:proofErr w:type="spellStart"/>
-      <w:r>
-        <w:t>bcrypt</w:t>
-      </w:r>
-      <w:proofErr w:type="spellEnd"/>
-      <w:r>
-        <w:t xml:space="preserve"> with unique salts. User data is limited to account identity/contact information required by the application. Demo credentials are for assessment use only.</w:t>
+        <w:t>Passwords are stored as SHA-256 hashes for this academic implementation. A production deployment should use a password-specific password hashing algorithm such as Argon2 or bcrypt with unique salts. User data is limited to account identity/contact information required by the application. Demo credentials are for assessment use only.</w:t>
       </w:r>
     </w:p>
     <w:p>
@@ -7965,15 +7957,7 @@
         <w:ind w:hanging="116"/>
       </w:pPr>
       <w:r>
-        <w:t>SHA-256 is retained for academic compatibility; Argon2/</w:t>
-      </w:r>
-      <w:proofErr w:type="spellStart"/>
-      <w:r>
-        <w:t>bcrypt</w:t>
-      </w:r>
-      <w:proofErr w:type="spellEnd"/>
-      <w:r>
-        <w:t xml:space="preserve"> is recommended for production.</w:t>
+        <w:t>SHA-256 is retained for academic compatibility; Argon2/bcrypt is recommended for production.</w:t>
       </w:r>
     </w:p>
     <w:p>
@@ -8009,15 +7993,7 @@
         <w:ind w:hanging="116"/>
       </w:pPr>
       <w:r>
-        <w:t xml:space="preserve">The supplied ZIP did not contain a prior Git repository, so original Week 5 history and genuine historical pull </w:t>
-      </w:r>
-      <w:proofErr w:type="spellStart"/>
-      <w:r>
-        <w:t>requestscannot</w:t>
-      </w:r>
-      <w:proofErr w:type="spellEnd"/>
-      <w:r>
-        <w:t xml:space="preserve"> be reconstructed without fabricating evidence. The final repository should therefore be pushed to the team's real GitHub repository if historical work exists there.</w:t>
+        <w:t>The supplied ZIP did not contain a prior Git repository, so original Week 5 history and genuine historical pull requestscannot be reconstructed without fabricating evidence. The final repository should therefore be pushed to the team's real GitHub repository if historical work exists there.</w:t>
       </w:r>
     </w:p>
     <w:p>
@@ -8208,6 +8184,7 @@
         <w:rPr>
           <w:noProof/>
         </w:rPr>
+        <w:lastRenderedPageBreak/>
         <w:drawing>
           <wp:inline distT="0" distB="0" distL="0" distR="0" wp14:anchorId="522A9F6D" wp14:editId="483305D8">
             <wp:extent cx="5220000" cy="2700000"/>
@@ -8261,7 +8238,6 @@
         <w:tblCellMar>
           <w:top w:w="98" w:type="dxa"/>
           <w:left w:w="120" w:type="dxa"/>
-          <w:bottom w:w="0" w:type="dxa"/>
           <w:right w:w="115" w:type="dxa"/>
         </w:tblCellMar>
         <w:tblLook w:val="04A0" w:firstRow="1" w:lastRow="0" w:firstColumn="1" w:lastColumn="0" w:noHBand="0" w:noVBand="1"/>
@@ -10316,6 +10292,7 @@
         <w:ind w:left="58"/>
       </w:pPr>
       <w:r>
+        <w:lastRenderedPageBreak/>
         <w:t>4. Negative/Edge Cases</w:t>
       </w:r>
     </w:p>
@@ -10447,6 +10424,113 @@
         </w:numPr>
         <w:spacing w:after="393"/>
         <w:ind w:hanging="116"/>
+      </w:pPr>
+      <w:r>
+        <w:t>Invalid JSON/missing files.</w:t>
+      </w:r>
+    </w:p>
+    <w:p>
+      <w:pPr>
+        <w:spacing w:after="149"/>
+        <w:ind w:left="58"/>
+      </w:pPr>
+      <w:r>
+        <w:rPr>
+          <w:b/>
+          <w:sz w:val="28"/>
+        </w:rPr>
+        <w:t>5. Defect Log and Fixes</w:t>
+      </w:r>
+    </w:p>
+    <w:p>
+      <w:pPr>
+        <w:pStyle w:val="Heading2"/>
+        <w:spacing w:before="359"/>
+        <w:ind w:left="58"/>
+      </w:pPr>
+      <w:r>
+        <w:t>6. UAT Sign-Off Record</w:t>
+      </w:r>
+    </w:p>
+    <w:p>
+      <w:pPr>
+        <w:ind w:left="58"/>
+      </w:pPr>
+      <w:r>
+        <w:t>UAT must be completed by an actual user/team member and signed before submission. Do not fabricate this signature.</w:t>
+      </w:r>
+    </w:p>
+    <w:p>
+      <w:pPr>
+        <w:ind w:left="58"/>
+      </w:pPr>
+      <w:r>
+        <w:t>Tester name: ____________________________________</w:t>
+      </w:r>
+    </w:p>
+    <w:p>
+      <w:pPr>
+        <w:ind w:left="58"/>
+      </w:pPr>
+      <w:r>
+        <w:t>Role: ___________________________________________</w:t>
+      </w:r>
+    </w:p>
+    <w:p>
+      <w:pPr>
+        <w:ind w:left="58"/>
+      </w:pPr>
+      <w:r>
+        <w:t>Date: ___________________________________________</w:t>
+      </w:r>
+    </w:p>
+    <w:p>
+      <w:pPr>
+        <w:spacing w:after="257"/>
+        <w:ind w:left="58"/>
+      </w:pPr>
+      <w:r>
+        <w:t>Version/commit: __________________________________</w:t>
+      </w:r>
+    </w:p>
+    <w:p>
+      <w:pPr>
+        <w:spacing w:after="254"/>
+        <w:ind w:left="58"/>
+      </w:pPr>
+      <w:r>
+        <w:t>I confirm that I used the application according to the User Manual and that the major workflows met the agreed acceptance criteria.</w:t>
+      </w:r>
+    </w:p>
+    <w:p>
+      <w:pPr>
+        <w:ind w:left="58"/>
+      </w:pPr>
+      <w:r>
+        <w:t>Accepted: Yes / No</w:t>
+      </w:r>
+    </w:p>
+    <w:p>
+      <w:pPr>
+        <w:spacing w:after="393"/>
+        <w:ind w:left="58"/>
+      </w:pPr>
+      <w:r>
+        <w:t>Signature: _______________________________________</w:t>
+      </w:r>
+    </w:p>
+    <w:p>
+      <w:pPr>
+        <w:pStyle w:val="Heading2"/>
+        <w:ind w:left="58"/>
+      </w:pPr>
+      <w:r>
+        <w:t>7. Evidence Files</w:t>
+      </w:r>
+    </w:p>
+    <w:p>
+      <w:pPr>
+        <w:ind w:left="58"/>
       </w:pPr>
       <w:r>
         <w:rPr>
@@ -10457,16 +10541,16 @@
         <mc:AlternateContent>
           <mc:Choice Requires="wpg">
             <w:drawing>
-              <wp:anchor distT="0" distB="0" distL="114300" distR="114300" simplePos="0" relativeHeight="251658240" behindDoc="0" locked="0" layoutInCell="1" allowOverlap="1" wp14:anchorId="687402DD" wp14:editId="459EB87E">
+              <wp:anchor distT="0" distB="0" distL="114300" distR="114300" simplePos="0" relativeHeight="251658240" behindDoc="0" locked="0" layoutInCell="1" allowOverlap="1" wp14:anchorId="687402DD" wp14:editId="3A86EE62">
                 <wp:simplePos x="0" y="0"/>
                 <wp:positionH relativeFrom="page">
-                  <wp:posOffset>-31023</wp:posOffset>
+                  <wp:align>left</wp:align>
                 </wp:positionH>
                 <wp:positionV relativeFrom="page">
-                  <wp:posOffset>7438250</wp:posOffset>
+                  <wp:posOffset>7600950</wp:posOffset>
                 </wp:positionV>
-                <wp:extent cx="7625131" cy="1828800"/>
-                <wp:effectExtent l="0" t="0" r="0" b="0"/>
+                <wp:extent cx="7726680" cy="1790700"/>
+                <wp:effectExtent l="0" t="0" r="26670" b="19050"/>
                 <wp:wrapTopAndBottom/>
                 <wp:docPr id="18674" name="Group 18674"/>
                 <wp:cNvGraphicFramePr/>
@@ -10477,7 +10561,7 @@
                       <wpg:grpSpPr>
                         <a:xfrm>
                           <a:off x="0" y="0"/>
-                          <a:ext cx="7625131" cy="1828800"/>
+                          <a:ext cx="7726680" cy="1790700"/>
                           <a:chOff x="0" y="0"/>
                           <a:chExt cx="7625131" cy="1828800"/>
                         </a:xfrm>
@@ -12065,491 +12149,522 @@
                     </wpg:wgp>
                   </a:graphicData>
                 </a:graphic>
+                <wp14:sizeRelH relativeFrom="margin">
+                  <wp14:pctWidth>0</wp14:pctWidth>
+                </wp14:sizeRelH>
+                <wp14:sizeRelV relativeFrom="margin">
+                  <wp14:pctHeight>0</wp14:pctHeight>
+                </wp14:sizeRelV>
               </wp:anchor>
             </w:drawing>
           </mc:Choice>
-          <mc:Fallback xmlns:a="http://schemas.openxmlformats.org/drawingml/2006/main">
+          <mc:Fallback>
             <w:pict>
-              <v:group id="Group 18674" style="width:600.404pt;height:144pt;position:absolute;mso-position-horizontal-relative:page;mso-position-horizontal:absolute;margin-left:-2.4428pt;mso-position-vertical-relative:page;margin-top:585.689pt;" coordsize="76251,18288">
-                <v:shape id="Shape 20258" style="position:absolute;width:75600;height:2286;left:310;top:0;" coordsize="7560000,228600" path="m0,0l7560000,0l7560000,228600l0,228600l0,0">
-                  <v:stroke weight="0pt" endcap="flat" joinstyle="miter" miterlimit="10" on="false" color="#000000" opacity="0"/>
-                  <v:fill on="true" color="#1f4e79"/>
+              <v:group w14:anchorId="687402DD" id="Group 18674" o:spid="_x0000_s1026" style="position:absolute;left:0;text-align:left;margin-left:0;margin-top:598.5pt;width:608.4pt;height:141pt;z-index:251658240;mso-position-horizontal:left;mso-position-horizontal-relative:page;mso-position-vertical-relative:page;mso-width-relative:margin;mso-height-relative:margin" coordsize="76251,18288" o:gfxdata="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">
+                <v:shape id="Shape 20250" o:spid="_x0000_s1027" style="position:absolute;left:310;width:75600;height:2286;visibility:visible;mso-wrap-style:square;v-text-anchor:top" coordsize="7560000,228600" o:gfxdata="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" path="m,l7560000,r,228600l,228600,,e" fillcolor="#1f4e79" stroked="f" strokeweight="0">
+                  <v:stroke miterlimit="83231f" joinstyle="miter"/>
+                  <v:path arrowok="t" textboxrect="0,0,7560000,228600"/>
                 </v:shape>
-                <v:shape id="Shape 20259" style="position:absolute;width:75600;height:2286;left:310;top:2286;" coordsize="7560000,228600" path="m0,0l7560000,0l7560000,228600l0,228600l0,0">
-                  <v:stroke weight="0pt" endcap="flat" joinstyle="miter" miterlimit="10" on="false" color="#000000" opacity="0"/>
-                  <v:fill on="true" color="#ffffff"/>
+                <v:shape id="Shape 20251" o:spid="_x0000_s1028" style="position:absolute;left:310;top:2286;width:75600;height:2286;visibility:visible;mso-wrap-style:square;v-text-anchor:top" coordsize="7560000,228600" o:gfxdata="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" path="m,l7560000,r,228600l,228600,,e" stroked="f" strokeweight="0">
+                  <v:stroke miterlimit="83231f" joinstyle="miter"/>
+                  <v:path arrowok="t" textboxrect="0,0,7560000,228600"/>
                 </v:shape>
-                <v:shape id="Shape 20260" style="position:absolute;width:75600;height:2286;left:310;top:4572;" coordsize="7560000,228600" path="m0,0l7560000,0l7560000,228600l0,228600l0,0">
-                  <v:stroke weight="0pt" endcap="flat" joinstyle="miter" miterlimit="10" on="false" color="#000000" opacity="0"/>
-                  <v:fill on="true" color="#f4f6f8"/>
+                <v:shape id="Shape 20252" o:spid="_x0000_s1029" style="position:absolute;left:310;top:4572;width:75600;height:2286;visibility:visible;mso-wrap-style:square;v-text-anchor:top" coordsize="7560000,228600" o:gfxdata="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" path="m,l7560000,r,228600l,228600,,e" fillcolor="#f4f6f8" stroked="f" strokeweight="0">
+                  <v:stroke miterlimit="83231f" joinstyle="miter"/>
+                  <v:path arrowok="t" textboxrect="0,0,7560000,228600"/>
                 </v:shape>
-                <v:shape id="Shape 20261" style="position:absolute;width:75600;height:2286;left:310;top:6858;" coordsize="7560000,228600" path="m0,0l7560000,0l7560000,228600l0,228600l0,0">
-                  <v:stroke weight="0pt" endcap="flat" joinstyle="miter" miterlimit="10" on="false" color="#000000" opacity="0"/>
-                  <v:fill on="true" color="#ffffff"/>
+                <v:shape id="Shape 20253" o:spid="_x0000_s1030" style="position:absolute;left:310;top:6858;width:75600;height:2286;visibility:visible;mso-wrap-style:square;v-text-anchor:top" coordsize="7560000,228600" o:gfxdata="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" path="m,l7560000,r,228600l,228600,,e" stroked="f" strokeweight="0">
+                  <v:stroke miterlimit="83231f" joinstyle="miter"/>
+                  <v:path arrowok="t" textboxrect="0,0,7560000,228600"/>
                 </v:shape>
-                <v:shape id="Shape 20262" style="position:absolute;width:75600;height:2286;left:310;top:9144;" coordsize="7560000,228600" path="m0,0l7560000,0l7560000,228600l0,228600l0,0">
-                  <v:stroke weight="0pt" endcap="flat" joinstyle="miter" miterlimit="10" on="false" color="#000000" opacity="0"/>
-                  <v:fill on="true" color="#f4f6f8"/>
+                <v:shape id="Shape 20254" o:spid="_x0000_s1031" style="position:absolute;left:310;top:9144;width:75600;height:2286;visibility:visible;mso-wrap-style:square;v-text-anchor:top" coordsize="7560000,228600" o:gfxdata="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" path="m,l7560000,r,228600l,228600,,e" fillcolor="#f4f6f8" stroked="f" strokeweight="0">
+                  <v:stroke miterlimit="83231f" joinstyle="miter"/>
+                  <v:path arrowok="t" textboxrect="0,0,7560000,228600"/>
                 </v:shape>
-                <v:shape id="Shape 20263" style="position:absolute;width:75600;height:2286;left:310;top:11430;" coordsize="7560000,228600" path="m0,0l7560000,0l7560000,228600l0,228600l0,0">
-                  <v:stroke weight="0pt" endcap="flat" joinstyle="miter" miterlimit="10" on="false" color="#000000" opacity="0"/>
-                  <v:fill on="true" color="#ffffff"/>
+                <v:shape id="Shape 20255" o:spid="_x0000_s1032" style="position:absolute;left:310;top:11430;width:75600;height:2286;visibility:visible;mso-wrap-style:square;v-text-anchor:top" coordsize="7560000,228600" o:gfxdata="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" path="m,l7560000,r,228600l,228600,,e" stroked="f" strokeweight="0">
+                  <v:stroke miterlimit="83231f" joinstyle="miter"/>
+                  <v:path arrowok="t" textboxrect="0,0,7560000,228600"/>
                 </v:shape>
-                <v:shape id="Shape 20264" style="position:absolute;width:75600;height:2286;left:310;top:13716;" coordsize="7560000,228600" path="m0,0l7560000,0l7560000,228600l0,228600l0,0">
-                  <v:stroke weight="0pt" endcap="flat" joinstyle="miter" miterlimit="10" on="false" color="#000000" opacity="0"/>
-                  <v:fill on="true" color="#f4f6f8"/>
+                <v:shape id="Shape 20256" o:spid="_x0000_s1033" style="position:absolute;left:310;top:13716;width:75600;height:2286;visibility:visible;mso-wrap-style:square;v-text-anchor:top" coordsize="7560000,228600" o:gfxdata="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" path="m,l7560000,r,228600l,228600,,e" fillcolor="#f4f6f8" stroked="f" strokeweight="0">
+                  <v:stroke miterlimit="83231f" joinstyle="miter"/>
+                  <v:path arrowok="t" textboxrect="0,0,7560000,228600"/>
                 </v:shape>
-                <v:shape id="Shape 20265" style="position:absolute;width:75600;height:2286;left:310;top:16002;" coordsize="7560000,228600" path="m0,0l7560000,0l7560000,228600l0,228600l0,0">
-                  <v:stroke weight="0pt" endcap="flat" joinstyle="miter" miterlimit="10" on="false" color="#000000" opacity="0"/>
-                  <v:fill on="true" color="#ffffff"/>
+                <v:shape id="Shape 20257" o:spid="_x0000_s1034" style="position:absolute;left:310;top:16002;width:75600;height:2286;visibility:visible;mso-wrap-style:square;v-text-anchor:top" coordsize="7560000,228600" o:gfxdata="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" path="m,l7560000,r,228600l,228600,,e" stroked="f" strokeweight="0">
+                  <v:stroke miterlimit="83231f" joinstyle="miter"/>
+                  <v:path arrowok="t" textboxrect="0,0,7560000,228600"/>
                 </v:shape>
-                <v:rect id="Rectangle 1064" style="position:absolute;width:13275;height:1062;left:48;top:624;" filled="f" stroked="f">
+                <v:rect id="Rectangle 1064" o:spid="_x0000_s1035" style="position:absolute;left:48;top:624;width:13275;height:1062;visibility:visible;mso-wrap-style:square;v-text-anchor:top" o:gfxdata="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" filled="f" stroked="f">
                   <v:textbox inset="0,0,0,0">
                     <w:txbxContent>
                       <w:p>
                         <w:pPr>
-                          <w:spacing w:before="0" w:after="160" w:line="259" w:lineRule="auto"/>
+                          <w:spacing w:after="160" w:line="259" w:lineRule="auto"/>
                           <w:ind w:left="0" w:firstLine="0"/>
                         </w:pPr>
+                        <w:proofErr w:type="spellStart"/>
                         <w:r>
                           <w:rPr>
-                            <w:rFonts w:cs="Arial" w:hAnsi="Arial" w:eastAsia="Arial" w:ascii="Arial"/>
-                            <w:b w:val="1"/>
-                            <w:color w:val="ffffff"/>
+                            <w:b/>
+                            <w:color w:val="FFFFFF"/>
                             <w:sz w:val="14"/>
                           </w:rPr>
-                          <w:t xml:space="preserve">ound during final review</w:t>
+                          <w:t>ound</w:t>
+                        </w:r>
+                        <w:proofErr w:type="spellEnd"/>
+                        <w:r>
+                          <w:rPr>
+                            <w:b/>
+                            <w:color w:val="FFFFFF"/>
+                            <w:sz w:val="14"/>
+                          </w:rPr>
+                          <w:t xml:space="preserve"> during final review</w:t>
                         </w:r>
                       </w:p>
                     </w:txbxContent>
                   </v:textbox>
                 </v:rect>
-                <v:rect id="Rectangle 1065" style="position:absolute;width:1659;height:1062;left:49807;top:624;" filled="f" stroked="f">
+                <v:rect id="Rectangle 1065" o:spid="_x0000_s1036" style="position:absolute;left:49807;top:624;width:1659;height:1062;visibility:visible;mso-wrap-style:square;v-text-anchor:top" o:gfxdata="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" filled="f" stroked="f">
                   <v:textbox inset="0,0,0,0">
                     <w:txbxContent>
                       <w:p>
                         <w:pPr>
-                          <w:spacing w:before="0" w:after="160" w:line="259" w:lineRule="auto"/>
+                          <w:spacing w:after="160" w:line="259" w:lineRule="auto"/>
                           <w:ind w:left="0" w:firstLine="0"/>
                         </w:pPr>
                         <w:r>
                           <w:rPr>
-                            <w:rFonts w:cs="Arial" w:hAnsi="Arial" w:eastAsia="Arial" w:ascii="Arial"/>
-                            <w:b w:val="1"/>
-                            <w:color w:val="ffffff"/>
+                            <w:b/>
+                            <w:color w:val="FFFFFF"/>
                             <w:sz w:val="14"/>
                           </w:rPr>
-                          <w:t xml:space="preserve">Fix</w:t>
+                          <w:t>Fix</w:t>
                         </w:r>
                       </w:p>
                     </w:txbxContent>
                   </v:textbox>
                 </v:rect>
-                <v:rect id="Rectangle 1067" style="position:absolute;width:63830;height:1062;left:290;top:2910;" filled="f" stroked="f">
+                <v:rect id="Rectangle 1067" o:spid="_x0000_s1037" style="position:absolute;left:290;top:2910;width:63830;height:1062;visibility:visible;mso-wrap-style:square;v-text-anchor:top" o:gfxdata="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" filled="f" stroked="f">
                   <v:textbox inset="0,0,0,0">
                     <w:txbxContent>
                       <w:p>
                         <w:pPr>
-                          <w:spacing w:before="0" w:after="160" w:line="259" w:lineRule="auto"/>
+                          <w:spacing w:after="160" w:line="259" w:lineRule="auto"/>
                           <w:ind w:left="0" w:firstLine="0"/>
                         </w:pPr>
                         <w:r>
                           <w:rPr>
                             <w:sz w:val="14"/>
                           </w:rPr>
-                          <w:t xml:space="preserve">ne `schema.sql` did not match the live application schema (`password` vs `password_hash`, role values, order-item columns).</w:t>
+                          <w:t>ne `schema.sql` did not match the live application schema (`password` vs `</w:t>
+                        </w:r>
+                        <w:proofErr w:type="spellStart"/>
+                        <w:r>
+                          <w:rPr>
+                            <w:sz w:val="14"/>
+                          </w:rPr>
+                          <w:t>password_hash</w:t>
+                        </w:r>
+                        <w:proofErr w:type="spellEnd"/>
+                        <w:r>
+                          <w:rPr>
+                            <w:sz w:val="14"/>
+                          </w:rPr>
+                          <w:t>`, role values, order-item columns).</w:t>
                         </w:r>
                       </w:p>
                     </w:txbxContent>
                   </v:textbox>
                 </v:rect>
-                <v:rect id="Rectangle 1069" style="position:absolute;width:34983;height:1062;left:49807;top:2910;" filled="f" stroked="f">
+                <v:rect id="Rectangle 1069" o:spid="_x0000_s1038" style="position:absolute;left:49807;top:2910;width:34983;height:1062;visibility:visible;mso-wrap-style:square;v-text-anchor:top" o:gfxdata="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" filled="f" stroked="f">
                   <v:textbox inset="0,0,0,0">
                     <w:txbxContent>
                       <w:p>
                         <w:pPr>
-                          <w:spacing w:before="0" w:after="160" w:line="259" w:lineRule="auto"/>
+                          <w:spacing w:after="160" w:line="259" w:lineRule="auto"/>
                           <w:ind w:left="0" w:firstLine="0"/>
                         </w:pPr>
                         <w:r>
                           <w:rPr>
                             <w:sz w:val="14"/>
                           </w:rPr>
-                          <w:t xml:space="preserve">Rebuilt `schema.sql` to match the application and added schema reg</w:t>
+                          <w:t>Rebuilt `schema.sql` to match the application and added schema reg</w:t>
                         </w:r>
                       </w:p>
                     </w:txbxContent>
                   </v:textbox>
                 </v:rect>
-                <v:rect id="Rectangle 1071" style="position:absolute;width:62938;height:1062;left:144;top:5196;" filled="f" stroked="f">
+                <v:rect id="Rectangle 1071" o:spid="_x0000_s1039" style="position:absolute;left:144;top:5196;width:62938;height:1062;visibility:visible;mso-wrap-style:square;v-text-anchor:top" o:gfxdata="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" filled="f" stroked="f">
                   <v:textbox inset="0,0,0,0">
                     <w:txbxContent>
                       <w:p>
                         <w:pPr>
-                          <w:spacing w:before="0" w:after="160" w:line="259" w:lineRule="auto"/>
+                          <w:spacing w:after="160" w:line="259" w:lineRule="auto"/>
+                          <w:ind w:left="0" w:firstLine="0"/>
+                        </w:pPr>
+                        <w:proofErr w:type="spellStart"/>
+                        <w:r>
+                          <w:rPr>
+                            <w:sz w:val="14"/>
+                          </w:rPr>
+                          <w:t>ntroller</w:t>
+                        </w:r>
+                        <w:proofErr w:type="spellEnd"/>
+                        <w:r>
+                          <w:rPr>
+                            <w:sz w:val="14"/>
+                          </w:rPr>
+                          <w:t>` constructed `</w:t>
+                        </w:r>
+                        <w:proofErr w:type="spellStart"/>
+                        <w:r>
+                          <w:rPr>
+                            <w:sz w:val="14"/>
+                          </w:rPr>
+                          <w:t>OrderRepository</w:t>
+                        </w:r>
+                        <w:proofErr w:type="spellEnd"/>
+                        <w:r>
+                          <w:rPr>
+                            <w:sz w:val="14"/>
+                          </w:rPr>
+                          <w:t>` without its item/status repositories, so runtime cancellation could fail to restore stock.</w:t>
+                        </w:r>
+                      </w:p>
+                    </w:txbxContent>
+                  </v:textbox>
+                </v:rect>
+                <v:rect id="Rectangle 1073" o:spid="_x0000_s1040" style="position:absolute;left:49807;top:5196;width:35170;height:1062;visibility:visible;mso-wrap-style:square;v-text-anchor:top" o:gfxdata="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" filled="f" stroked="f">
+                  <v:textbox inset="0,0,0,0">
+                    <w:txbxContent>
+                      <w:p>
+                        <w:pPr>
+                          <w:spacing w:after="160" w:line="259" w:lineRule="auto"/>
                           <w:ind w:left="0" w:firstLine="0"/>
                         </w:pPr>
                         <w:r>
                           <w:rPr>
                             <w:sz w:val="14"/>
                           </w:rPr>
-                          <w:t xml:space="preserve">ntroller` constructed `OrderRepository` without its item/status repositories, so runtime cancellation could fail to restore stock.</w:t>
+                          <w:t>Wired `</w:t>
                         </w:r>
+                        <w:proofErr w:type="spellStart"/>
+                        <w:r>
+                          <w:rPr>
+                            <w:sz w:val="14"/>
+                          </w:rPr>
+                          <w:t>OrderRepository</w:t>
+                        </w:r>
+                        <w:proofErr w:type="spellEnd"/>
+                        <w:r>
+                          <w:rPr>
+                            <w:sz w:val="14"/>
+                          </w:rPr>
+                          <w:t xml:space="preserve">` with all required dependencies during </w:t>
+                        </w:r>
+                        <w:proofErr w:type="spellStart"/>
+                        <w:r>
+                          <w:rPr>
+                            <w:sz w:val="14"/>
+                          </w:rPr>
+                          <w:t>applic</w:t>
+                        </w:r>
+                        <w:proofErr w:type="spellEnd"/>
                       </w:p>
                     </w:txbxContent>
                   </v:textbox>
                 </v:rect>
-                <v:rect id="Rectangle 1073" style="position:absolute;width:35170;height:1062;left:49807;top:5196;" filled="f" stroked="f">
+                <v:rect id="Rectangle 1075" o:spid="_x0000_s1041" style="position:absolute;top:7482;width:41241;height:1062;visibility:visible;mso-wrap-style:square;v-text-anchor:top" o:gfxdata="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" filled="f" stroked="f">
                   <v:textbox inset="0,0,0,0">
                     <w:txbxContent>
                       <w:p>
                         <w:pPr>
-                          <w:spacing w:before="0" w:after="160" w:line="259" w:lineRule="auto"/>
+                          <w:spacing w:after="160" w:line="259" w:lineRule="auto"/>
                           <w:ind w:left="0" w:firstLine="0"/>
                         </w:pPr>
                         <w:r>
                           <w:rPr>
                             <w:sz w:val="14"/>
                           </w:rPr>
-                          <w:t xml:space="preserve">Wired `OrderRepository` with all required dependencies during applic</w:t>
+                          <w:t>E/user manual used an incorrect `python main.py` command and outdated paths.</w:t>
                         </w:r>
                       </w:p>
                     </w:txbxContent>
                   </v:textbox>
                 </v:rect>
-                <v:rect id="Rectangle 1075" style="position:absolute;width:41241;height:1062;left:0;top:7482;" filled="f" stroked="f">
+                <v:rect id="Rectangle 1077" o:spid="_x0000_s1042" style="position:absolute;left:49807;top:7482;width:34982;height:1062;visibility:visible;mso-wrap-style:square;v-text-anchor:top" o:gfxdata="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" filled="f" stroked="f">
                   <v:textbox inset="0,0,0,0">
                     <w:txbxContent>
                       <w:p>
                         <w:pPr>
-                          <w:spacing w:before="0" w:after="160" w:line="259" w:lineRule="auto"/>
+                          <w:spacing w:after="160" w:line="259" w:lineRule="auto"/>
                           <w:ind w:left="0" w:firstLine="0"/>
                         </w:pPr>
                         <w:r>
                           <w:rPr>
                             <w:sz w:val="14"/>
                           </w:rPr>
-                          <w:t xml:space="preserve">E/user manual used an incorrect `python main.py` command and outdated paths.</w:t>
+                          <w:t xml:space="preserve">Updated instructions to `python -m </w:t>
+                        </w:r>
+                        <w:proofErr w:type="spellStart"/>
+                        <w:r>
+                          <w:rPr>
+                            <w:sz w:val="14"/>
+                          </w:rPr>
+                          <w:t>src.main</w:t>
+                        </w:r>
+                        <w:proofErr w:type="spellEnd"/>
+                        <w:r>
+                          <w:rPr>
+                            <w:sz w:val="14"/>
+                          </w:rPr>
+                          <w:t>` and corrected database</w:t>
                         </w:r>
                       </w:p>
                     </w:txbxContent>
                   </v:textbox>
                 </v:rect>
-                <v:rect id="Rectangle 1077" style="position:absolute;width:34982;height:1062;left:49807;top:7482;" filled="f" stroked="f">
+                <v:rect id="Rectangle 1079" o:spid="_x0000_s1043" style="position:absolute;left:192;top:9768;width:32365;height:1062;visibility:visible;mso-wrap-style:square;v-text-anchor:top" o:gfxdata="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" filled="f" stroked="f">
                   <v:textbox inset="0,0,0,0">
                     <w:txbxContent>
                       <w:p>
                         <w:pPr>
-                          <w:spacing w:before="0" w:after="160" w:line="259" w:lineRule="auto"/>
+                          <w:spacing w:after="160" w:line="259" w:lineRule="auto"/>
+                          <w:ind w:left="0" w:firstLine="0"/>
+                        </w:pPr>
+                        <w:proofErr w:type="spellStart"/>
+                        <w:r>
+                          <w:rPr>
+                            <w:sz w:val="14"/>
+                          </w:rPr>
+                          <w:t>ethod</w:t>
+                        </w:r>
+                        <w:proofErr w:type="spellEnd"/>
+                        <w:r>
+                          <w:rPr>
+                            <w:sz w:val="14"/>
+                          </w:rPr>
+                          <w:t>/property docstrings were incomplete relative to the rubric.</w:t>
+                        </w:r>
+                      </w:p>
+                    </w:txbxContent>
+                  </v:textbox>
+                </v:rect>
+                <v:rect id="Rectangle 1080" o:spid="_x0000_s1044" style="position:absolute;left:49807;top:9768;width:25407;height:1062;visibility:visible;mso-wrap-style:square;v-text-anchor:top" o:gfxdata="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" filled="f" stroked="f">
+                  <v:textbox inset="0,0,0,0">
+                    <w:txbxContent>
+                      <w:p>
+                        <w:pPr>
+                          <w:spacing w:after="160" w:line="259" w:lineRule="auto"/>
                           <w:ind w:left="0" w:firstLine="0"/>
                         </w:pPr>
                         <w:r>
                           <w:rPr>
                             <w:sz w:val="14"/>
                           </w:rPr>
-                          <w:t xml:space="preserve">Updated instructions to `python -m src.main` and corrected database</w:t>
+                          <w:t>Added docstrings to all public methods/properties.</w:t>
                         </w:r>
                       </w:p>
                     </w:txbxContent>
                   </v:textbox>
                 </v:rect>
-                <v:rect id="Rectangle 1079" style="position:absolute;width:32364;height:1062;left:192;top:9768;" filled="f" stroked="f">
+                <v:rect id="Rectangle 1082" o:spid="_x0000_s1045" style="position:absolute;left:240;top:12054;width:30003;height:1062;visibility:visible;mso-wrap-style:square;v-text-anchor:top" o:gfxdata="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" filled="f" stroked="f">
                   <v:textbox inset="0,0,0,0">
                     <w:txbxContent>
                       <w:p>
                         <w:pPr>
-                          <w:spacing w:before="0" w:after="160" w:line="259" w:lineRule="auto"/>
+                          <w:spacing w:after="160" w:line="259" w:lineRule="auto"/>
+                          <w:ind w:left="0" w:firstLine="0"/>
+                        </w:pPr>
+                        <w:proofErr w:type="spellStart"/>
+                        <w:r>
+                          <w:rPr>
+                            <w:sz w:val="14"/>
+                          </w:rPr>
+                          <w:t>tion</w:t>
+                        </w:r>
+                        <w:proofErr w:type="spellEnd"/>
+                        <w:r>
+                          <w:rPr>
+                            <w:sz w:val="14"/>
+                          </w:rPr>
+                          <w:t xml:space="preserve"> exception text incorrectly referred to status `Received`.</w:t>
+                        </w:r>
+                      </w:p>
+                    </w:txbxContent>
+                  </v:textbox>
+                </v:rect>
+                <v:rect id="Rectangle 1083" o:spid="_x0000_s1046" style="position:absolute;left:49807;top:12054;width:21768;height:1062;visibility:visible;mso-wrap-style:square;v-text-anchor:top" o:gfxdata="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" filled="f" stroked="f">
+                  <v:textbox inset="0,0,0,0">
+                    <w:txbxContent>
+                      <w:p>
+                        <w:pPr>
+                          <w:spacing w:after="160" w:line="259" w:lineRule="auto"/>
                           <w:ind w:left="0" w:firstLine="0"/>
                         </w:pPr>
                         <w:r>
                           <w:rPr>
                             <w:sz w:val="14"/>
                           </w:rPr>
-                          <w:t xml:space="preserve">ethod/property docstrings were incomplete relative to the rubric.</w:t>
+                          <w:t>Corrected message to Pending/Confirmed.</w:t>
                         </w:r>
                       </w:p>
                     </w:txbxContent>
                   </v:textbox>
                 </v:rect>
-                <v:rect id="Rectangle 1080" style="position:absolute;width:25407;height:1062;left:49807;top:9768;" filled="f" stroked="f">
+                <v:rect id="Rectangle 1085" o:spid="_x0000_s1047" style="position:absolute;left:289;top:14340;width:21001;height:1062;visibility:visible;mso-wrap-style:square;v-text-anchor:top" o:gfxdata="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" filled="f" stroked="f">
                   <v:textbox inset="0,0,0,0">
                     <w:txbxContent>
                       <w:p>
                         <w:pPr>
-                          <w:spacing w:before="0" w:after="160" w:line="259" w:lineRule="auto"/>
+                          <w:spacing w:after="160" w:line="259" w:lineRule="auto"/>
+                          <w:ind w:left="0" w:firstLine="0"/>
+                        </w:pPr>
+                        <w:proofErr w:type="spellStart"/>
+                        <w:r>
+                          <w:rPr>
+                            <w:sz w:val="14"/>
+                          </w:rPr>
+                          <w:t>letion</w:t>
+                        </w:r>
+                        <w:proofErr w:type="spellEnd"/>
+                        <w:r>
+                          <w:rPr>
+                            <w:sz w:val="14"/>
+                          </w:rPr>
+                          <w:t xml:space="preserve"> was not exposed as explicit CRUD.</w:t>
+                        </w:r>
+                      </w:p>
+                    </w:txbxContent>
+                  </v:textbox>
+                </v:rect>
+                <v:rect id="Rectangle 1087" o:spid="_x0000_s1048" style="position:absolute;left:49807;top:14340;width:34980;height:1062;visibility:visible;mso-wrap-style:square;v-text-anchor:top" o:gfxdata="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" filled="f" stroked="f">
+                  <v:textbox inset="0,0,0,0">
+                    <w:txbxContent>
+                      <w:p>
+                        <w:pPr>
+                          <w:spacing w:after="160" w:line="259" w:lineRule="auto"/>
                           <w:ind w:left="0" w:firstLine="0"/>
                         </w:pPr>
                         <w:r>
                           <w:rPr>
                             <w:sz w:val="14"/>
                           </w:rPr>
-                          <w:t xml:space="preserve">Added docstrings to all public methods/properties.</w:t>
+                          <w:t>Added transactional `</w:t>
+                        </w:r>
+                        <w:proofErr w:type="spellStart"/>
+                        <w:r>
+                          <w:rPr>
+                            <w:sz w:val="14"/>
+                          </w:rPr>
+                          <w:t>OrderRepository.delete</w:t>
+                        </w:r>
+                        <w:proofErr w:type="spellEnd"/>
+                        <w:r>
+                          <w:rPr>
+                            <w:sz w:val="14"/>
+                          </w:rPr>
+                          <w:t>()` and administrator me</w:t>
                         </w:r>
                       </w:p>
                     </w:txbxContent>
                   </v:textbox>
                 </v:rect>
-                <v:rect id="Rectangle 1082" style="position:absolute;width:30002;height:1062;left:240;top:12054;" filled="f" stroked="f">
+                <v:rect id="Rectangle 1089" o:spid="_x0000_s1049" style="position:absolute;left:289;top:16626;width:37792;height:1062;visibility:visible;mso-wrap-style:square;v-text-anchor:top" o:gfxdata="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" filled="f" stroked="f">
                   <v:textbox inset="0,0,0,0">
                     <w:txbxContent>
                       <w:p>
                         <w:pPr>
-                          <w:spacing w:before="0" w:after="160" w:line="259" w:lineRule="auto"/>
+                          <w:spacing w:after="160" w:line="259" w:lineRule="auto"/>
                           <w:ind w:left="0" w:firstLine="0"/>
                         </w:pPr>
                         <w:r>
                           <w:rPr>
                             <w:sz w:val="14"/>
                           </w:rPr>
-                          <w:t xml:space="preserve">tion exception text incorrectly referred to status `Received`.</w:t>
+                          <w:t>a category referenced by food items produced a raw SQLite integrity error.</w:t>
                         </w:r>
                       </w:p>
                     </w:txbxContent>
                   </v:textbox>
                 </v:rect>
-                <v:rect id="Rectangle 1083" style="position:absolute;width:21768;height:1062;left:49807;top:12054;" filled="f" stroked="f">
+                <v:rect id="Rectangle 1090" o:spid="_x0000_s1050" style="position:absolute;left:49807;top:16626;width:34150;height:1062;visibility:visible;mso-wrap-style:square;v-text-anchor:top" o:gfxdata="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" filled="f" stroked="f">
                   <v:textbox inset="0,0,0,0">
                     <w:txbxContent>
                       <w:p>
                         <w:pPr>
-                          <w:spacing w:before="0" w:after="160" w:line="259" w:lineRule="auto"/>
+                          <w:spacing w:after="160" w:line="259" w:lineRule="auto"/>
                           <w:ind w:left="0" w:firstLine="0"/>
                         </w:pPr>
                         <w:r>
                           <w:rPr>
                             <w:sz w:val="14"/>
                           </w:rPr>
-                          <w:t xml:space="preserve">Corrected message to Pending/Confirmed.</w:t>
+                          <w:t>Added `</w:t>
+                        </w:r>
+                        <w:proofErr w:type="spellStart"/>
+                        <w:r>
+                          <w:rPr>
+                            <w:sz w:val="14"/>
+                          </w:rPr>
+                          <w:t>CategoryInUseError</w:t>
+                        </w:r>
+                        <w:proofErr w:type="spellEnd"/>
+                        <w:r>
+                          <w:rPr>
+                            <w:sz w:val="14"/>
+                          </w:rPr>
+                          <w:t>` and a user-facing controller message.</w:t>
                         </w:r>
                       </w:p>
                     </w:txbxContent>
                   </v:textbox>
                 </v:rect>
-                <v:rect id="Rectangle 1085" style="position:absolute;width:21000;height:1062;left:289;top:14340;" filled="f" stroked="f">
-                  <v:textbox inset="0,0,0,0">
-                    <w:txbxContent>
-                      <w:p>
-                        <w:pPr>
-                          <w:spacing w:before="0" w:after="160" w:line="259" w:lineRule="auto"/>
-                          <w:ind w:left="0" w:firstLine="0"/>
-                        </w:pPr>
-                        <w:r>
-                          <w:rPr>
-                            <w:sz w:val="14"/>
-                          </w:rPr>
-                          <w:t xml:space="preserve">letion was not exposed as explicit CRUD.</w:t>
-                        </w:r>
-                      </w:p>
-                    </w:txbxContent>
-                  </v:textbox>
-                </v:rect>
-                <v:rect id="Rectangle 1087" style="position:absolute;width:34980;height:1062;left:49807;top:14340;" filled="f" stroked="f">
-                  <v:textbox inset="0,0,0,0">
-                    <w:txbxContent>
-                      <w:p>
-                        <w:pPr>
-                          <w:spacing w:before="0" w:after="160" w:line="259" w:lineRule="auto"/>
-                          <w:ind w:left="0" w:firstLine="0"/>
-                        </w:pPr>
-                        <w:r>
-                          <w:rPr>
-                            <w:sz w:val="14"/>
-                          </w:rPr>
-                          <w:t xml:space="preserve">Added transactional `OrderRepository.delete()` and administrator me</w:t>
-                        </w:r>
-                      </w:p>
-                    </w:txbxContent>
-                  </v:textbox>
-                </v:rect>
-                <v:rect id="Rectangle 1089" style="position:absolute;width:37791;height:1062;left:289;top:16626;" filled="f" stroked="f">
-                  <v:textbox inset="0,0,0,0">
-                    <w:txbxContent>
-                      <w:p>
-                        <w:pPr>
-                          <w:spacing w:before="0" w:after="160" w:line="259" w:lineRule="auto"/>
-                          <w:ind w:left="0" w:firstLine="0"/>
-                        </w:pPr>
-                        <w:r>
-                          <w:rPr>
-                            <w:sz w:val="14"/>
-                          </w:rPr>
-                          <w:t xml:space="preserve">a category referenced by food items produced a raw SQLite integrity error.</w:t>
-                        </w:r>
-                      </w:p>
-                    </w:txbxContent>
-                  </v:textbox>
-                </v:rect>
-                <v:rect id="Rectangle 1090" style="position:absolute;width:34150;height:1062;left:49807;top:16626;" filled="f" stroked="f">
-                  <v:textbox inset="0,0,0,0">
-                    <w:txbxContent>
-                      <w:p>
-                        <w:pPr>
-                          <w:spacing w:before="0" w:after="160" w:line="259" w:lineRule="auto"/>
-                          <w:ind w:left="0" w:firstLine="0"/>
-                        </w:pPr>
-                        <w:r>
-                          <w:rPr>
-                            <w:sz w:val="14"/>
-                          </w:rPr>
-                          <w:t xml:space="preserve">Added `CategoryInUseError` and a user-facing controller message.</w:t>
-                        </w:r>
-                      </w:p>
-                    </w:txbxContent>
-                  </v:textbox>
-                </v:rect>
-                <v:shape id="Shape 1091" style="position:absolute;width:75600;height:0;left:310;top:0;" coordsize="7560000,0" path="m7560000,0l0,0">
-                  <v:stroke weight="0.3pt" endcap="round" joinstyle="round" on="true" color="#808080"/>
-                  <v:fill on="false" color="#000000" opacity="0"/>
+                <v:shape id="Shape 1091" o:spid="_x0000_s1051" style="position:absolute;left:310;width:75600;height:0;visibility:visible;mso-wrap-style:square;v-text-anchor:top" coordsize="7560000,0" o:gfxdata="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" path="m7560000,l,e" filled="f" strokecolor="gray" strokeweight=".3pt">
+                  <v:stroke endcap="round"/>
+                  <v:path arrowok="t" textboxrect="0,0,7560000,0"/>
                 </v:shape>
-                <v:shape id="Shape 1092" style="position:absolute;width:75600;height:0;left:310;top:18288;" coordsize="7560000,0" path="m7560000,0l0,0">
-                  <v:stroke weight="0.3pt" endcap="round" joinstyle="round" on="true" color="#808080"/>
-                  <v:fill on="false" color="#000000" opacity="0"/>
+                <v:shape id="Shape 1092" o:spid="_x0000_s1052" style="position:absolute;left:310;top:18288;width:75600;height:0;visibility:visible;mso-wrap-style:square;v-text-anchor:top" coordsize="7560000,0" o:gfxdata="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" path="m7560000,l,e" filled="f" strokecolor="gray" strokeweight=".3pt">
+                  <v:stroke endcap="round"/>
+                  <v:path arrowok="t" textboxrect="0,0,7560000,0"/>
                 </v:shape>
-                <v:shape id="Shape 1093" style="position:absolute;width:75600;height:0;left:310;top:2286;" coordsize="7560000,0" path="m7560000,0l0,0">
-                  <v:stroke weight="0.3pt" endcap="round" joinstyle="round" on="true" color="#808080"/>
-                  <v:fill on="false" color="#000000" opacity="0"/>
+                <v:shape id="Shape 1093" o:spid="_x0000_s1053" style="position:absolute;left:310;top:2286;width:75600;height:0;visibility:visible;mso-wrap-style:square;v-text-anchor:top" coordsize="7560000,0" o:gfxdata="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" path="m7560000,l,e" filled="f" strokecolor="gray" strokeweight=".3pt">
+                  <v:stroke endcap="round"/>
+                  <v:path arrowok="t" textboxrect="0,0,7560000,0"/>
                 </v:shape>
-                <v:shape id="Shape 1094" style="position:absolute;width:75600;height:0;left:310;top:4572;" coordsize="7560000,0" path="m7560000,0l0,0">
-                  <v:stroke weight="0.3pt" endcap="round" joinstyle="round" on="true" color="#808080"/>
-                  <v:fill on="false" color="#000000" opacity="0"/>
+                <v:shape id="Shape 1094" o:spid="_x0000_s1054" style="position:absolute;left:310;top:4572;width:75600;height:0;visibility:visible;mso-wrap-style:square;v-text-anchor:top" coordsize="7560000,0" o:gfxdata="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" path="m7560000,l,e" filled="f" strokecolor="gray" strokeweight=".3pt">
+                  <v:stroke endcap="round"/>
+                  <v:path arrowok="t" textboxrect="0,0,7560000,0"/>
                 </v:shape>
-                <v:shape id="Shape 1095" style="position:absolute;width:75600;height:0;left:310;top:6858;" coordsize="7560000,0" path="m7560000,0l0,0">
-                  <v:stroke weight="0.3pt" endcap="round" joinstyle="round" on="true" color="#808080"/>
-                  <v:fill on="false" color="#000000" opacity="0"/>
+                <v:shape id="Shape 1095" o:spid="_x0000_s1055" style="position:absolute;left:310;top:6858;width:75600;height:0;visibility:visible;mso-wrap-style:square;v-text-anchor:top" coordsize="7560000,0" o:gfxdata="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" path="m7560000,l,e" filled="f" strokecolor="gray" strokeweight=".3pt">
+                  <v:stroke endcap="round"/>
+                  <v:path arrowok="t" textboxrect="0,0,7560000,0"/>
                 </v:shape>
-                <v:shape id="Shape 1096" style="position:absolute;width:75600;height:0;left:310;top:9144;" coordsize="7560000,0" path="m7560000,0l0,0">
-                  <v:stroke weight="0.3pt" endcap="round" joinstyle="round" on="true" color="#808080"/>
-                  <v:fill on="false" color="#000000" opacity="0"/>
+                <v:shape id="Shape 1096" o:spid="_x0000_s1056" style="position:absolute;left:310;top:9144;width:75600;height:0;visibility:visible;mso-wrap-style:square;v-text-anchor:top" coordsize="7560000,0" o:gfxdata="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" path="m7560000,l,e" filled="f" strokecolor="gray" strokeweight=".3pt">
+                  <v:stroke endcap="round"/>
+                  <v:path arrowok="t" textboxrect="0,0,7560000,0"/>
                 </v:shape>
-                <v:shape id="Shape 1097" style="position:absolute;width:75600;height:0;left:310;top:11430;" coordsize="7560000,0" path="m7560000,0l0,0">
-                  <v:stroke weight="0.3pt" endcap="round" joinstyle="round" on="true" color="#808080"/>
-                  <v:fill on="false" color="#000000" opacity="0"/>
+                <v:shape id="Shape 1097" o:spid="_x0000_s1057" style="position:absolute;left:310;top:11430;width:75600;height:0;visibility:visible;mso-wrap-style:square;v-text-anchor:top" coordsize="7560000,0" o:gfxdata="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" path="m7560000,l,e" filled="f" strokecolor="gray" strokeweight=".3pt">
+                  <v:stroke endcap="round"/>
+                  <v:path arrowok="t" textboxrect="0,0,7560000,0"/>
                 </v:shape>
-                <v:shape id="Shape 1098" style="position:absolute;width:75600;height:0;left:310;top:13716;" coordsize="7560000,0" path="m7560000,0l0,0">
-                  <v:stroke weight="0.3pt" endcap="round" joinstyle="round" on="true" color="#808080"/>
-                  <v:fill on="false" color="#000000" opacity="0"/>
+                <v:shape id="Shape 1098" o:spid="_x0000_s1058" style="position:absolute;left:310;top:13716;width:75600;height:0;visibility:visible;mso-wrap-style:square;v-text-anchor:top" coordsize="7560000,0" o:gfxdata="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" path="m7560000,l,e" filled="f" strokecolor="gray" strokeweight=".3pt">
+                  <v:stroke endcap="round"/>
+                  <v:path arrowok="t" textboxrect="0,0,7560000,0"/>
                 </v:shape>
-                <v:shape id="Shape 1099" style="position:absolute;width:75600;height:0;left:310;top:16002;" coordsize="7560000,0" path="m7560000,0l0,0">
-                  <v:stroke weight="0.3pt" endcap="round" joinstyle="round" on="true" color="#808080"/>
-                  <v:fill on="false" color="#000000" opacity="0"/>
+                <v:shape id="Shape 1099" o:spid="_x0000_s1059" style="position:absolute;left:310;top:16002;width:75600;height:0;visibility:visible;mso-wrap-style:square;v-text-anchor:top" coordsize="7560000,0" o:gfxdata="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" path="m7560000,l,e" filled="f" strokecolor="gray" strokeweight=".3pt">
+                  <v:stroke endcap="round"/>
+                  <v:path arrowok="t" textboxrect="0,0,7560000,0"/>
                 </v:shape>
-                <v:shape id="Shape 1100" style="position:absolute;width:0;height:18288;left:49045;top:0;" coordsize="0,1828800" path="m0,1828800l0,0">
-                  <v:stroke weight="0.3pt" endcap="round" joinstyle="round" on="true" color="#808080"/>
-                  <v:fill on="false" color="#000000" opacity="0"/>
+                <v:shape id="Shape 1100" o:spid="_x0000_s1060" style="position:absolute;left:49045;width:0;height:18288;visibility:visible;mso-wrap-style:square;v-text-anchor:top" coordsize="0,1828800" o:gfxdata="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" path="m,1828800l,e" filled="f" strokecolor="gray" strokeweight=".3pt">
+                  <v:stroke endcap="round"/>
+                  <v:path arrowok="t" textboxrect="0,0,0,1828800"/>
                 </v:shape>
-                <w10:wrap type="topAndBottom"/>
+                <w10:wrap type="topAndBottom" anchorx="page" anchory="page"/>
               </v:group>
             </w:pict>
           </mc:Fallback>
         </mc:AlternateContent>
       </w:r>
-      <w:r>
-        <w:t>Invalid JSON/missing files.</w:t>
-      </w:r>
-    </w:p>
-    <w:p>
-      <w:pPr>
-        <w:spacing w:after="149"/>
-        <w:ind w:left="58"/>
-      </w:pPr>
-      <w:r>
-        <w:rPr>
-          <w:b/>
-          <w:sz w:val="28"/>
-        </w:rPr>
-        <w:t>5. Defect Log and Fixes</w:t>
-      </w:r>
-    </w:p>
-    <w:p>
-      <w:pPr>
-        <w:pStyle w:val="Heading2"/>
-        <w:spacing w:before="359"/>
-        <w:ind w:left="58"/>
-      </w:pPr>
-      <w:r>
-        <w:t>6. UAT Sign-Off Record</w:t>
-      </w:r>
-    </w:p>
-    <w:p>
-      <w:pPr>
-        <w:ind w:left="58"/>
-      </w:pPr>
-      <w:r>
-        <w:t>UAT must be completed by an actual user/team member and signed before submission. Do not fabricate this signature.</w:t>
-      </w:r>
-    </w:p>
-    <w:p>
-      <w:pPr>
-        <w:ind w:left="58"/>
-      </w:pPr>
-      <w:r>
-        <w:t>Tester name: ____________________________________</w:t>
-      </w:r>
-    </w:p>
-    <w:p>
-      <w:pPr>
-        <w:ind w:left="58"/>
-      </w:pPr>
-      <w:r>
-        <w:t>Role: ___________________________________________</w:t>
-      </w:r>
-    </w:p>
-    <w:p>
-      <w:pPr>
-        <w:ind w:left="58"/>
-      </w:pPr>
-      <w:r>
-        <w:t>Date: ___________________________________________</w:t>
-      </w:r>
-    </w:p>
-    <w:p>
-      <w:pPr>
-        <w:spacing w:after="257"/>
-        <w:ind w:left="58"/>
-      </w:pPr>
-      <w:r>
-        <w:t>Version/commit: __________________________________</w:t>
-      </w:r>
-    </w:p>
-    <w:p>
-      <w:pPr>
-        <w:spacing w:after="254"/>
-        <w:ind w:left="58"/>
-      </w:pPr>
-      <w:r>
-        <w:t>I confirm that I used the application according to the User Manual and that the major workflows met the agreed acceptance criteria.</w:t>
-      </w:r>
-    </w:p>
-    <w:p>
-      <w:pPr>
-        <w:ind w:left="58"/>
-      </w:pPr>
-      <w:r>
-        <w:t>Accepted: Yes / No</w:t>
-      </w:r>
-    </w:p>
-    <w:p>
-      <w:pPr>
-        <w:spacing w:after="393"/>
-        <w:ind w:left="58"/>
-      </w:pPr>
-      <w:r>
-        <w:t>Signature: _______________________________________</w:t>
-      </w:r>
-    </w:p>
-    <w:p>
-      <w:pPr>
-        <w:pStyle w:val="Heading2"/>
-        <w:ind w:left="58"/>
-      </w:pPr>
-      <w:r>
-        <w:t>7. Evidence Files</w:t>
-      </w:r>
-    </w:p>
-    <w:p>
-      <w:pPr>
-        <w:ind w:left="58"/>
-      </w:pPr>
       <w:r>
         <w:t>See docs/screenshots/ for application/test screenshots and docs/diagrams/ for architecture/database/class diagrams.</w:t>
       </w:r>

</xml_diff>